<commit_message>
completed till static pods and end-to-end flow of a pod
</commit_message>
<xml_diff>
--- a/docs (kubernetes)/kubernetes_for_absolute_beginners_kodekloud.docx
+++ b/docs (kubernetes)/kubernetes_for_absolute_beginners_kodekloud.docx
@@ -4767,7 +4767,21 @@
           <w:rFonts w:hint="default" w:ascii="Bodoni MT" w:hAnsi="Bodoni MT" w:eastAsia="Microsoft YaHei" w:cs="Bodoni MT"/>
           <w:lang w:val="en-US"/>
         </w:rPr>
-        <w:t xml:space="preserve"> (-link is the legacy method to link one container to another in docker)</w:t>
+        <w:t xml:space="preserve"> (</w:t>
+      </w:r>
+      <w:r>
+        <w:rPr>
+          <w:rFonts w:hint="default" w:ascii="Bodoni MT" w:hAnsi="Bodoni MT" w:eastAsia="Microsoft YaHei" w:cs="Bodoni MT"/>
+          <w:lang w:val="en-IN"/>
+        </w:rPr>
+        <w:t>-</w:t>
+      </w:r>
+      <w:r>
+        <w:rPr>
+          <w:rFonts w:hint="default" w:ascii="Bodoni MT" w:hAnsi="Bodoni MT" w:eastAsia="Microsoft YaHei" w:cs="Bodoni MT"/>
+          <w:lang w:val="en-US"/>
+        </w:rPr>
+        <w:t>-link is the legacy method to link one container to another in docker)</w:t>
       </w:r>
       <w:r>
         <w:rPr>
@@ -6947,7 +6961,7 @@
           <w:shd w:val="clear" w:color="auto" w:fill="auto"/>
           <w:lang w:val="en-IN"/>
         </w:rPr>
-        <w:t xml:space="preserve"> doesn’t’ update, just create the pods if doesn’t exist and don’t touch it later. If exist then error.</w:t>
+        <w:t xml:space="preserve"> doesn’t update, just create the pods if doesn’t exist. If exist then error.</w:t>
       </w:r>
       <w:r>
         <w:rPr>
@@ -8757,7 +8771,7 @@
           <w:iCs w:val="0"/>
           <w:lang w:val="en-IN"/>
         </w:rPr>
-        <w:t>This is mentioned to tell the ReplicaSets that which Pods come under this.</w:t>
+        <w:t>This is mentioned to tell the ReplicaSet that which Pods come under this.</w:t>
       </w:r>
     </w:p>
     <w:p>
@@ -12043,55 +12057,6 @@
     </w:p>
     <w:p>
       <w:pPr>
-        <w:keepNext w:val="0"/>
-        <w:keepLines w:val="0"/>
-        <w:widowControl/>
-        <w:numPr>
-          <w:ilvl w:val="1"/>
-          <w:numId w:val="11"/>
-        </w:numPr>
-        <w:suppressLineNumbers w:val="0"/>
-        <w:spacing w:before="0" w:beforeAutospacing="0" w:after="0" w:afterAutospacing="0" w:line="360" w:lineRule="auto"/>
-        <w:ind w:left="840" w:leftChars="0" w:right="0" w:hanging="420" w:firstLineChars="0"/>
-        <w:jc w:val="left"/>
-        <w:rPr>
-          <w:rFonts w:hint="default" w:ascii="Bodoni MT" w:hAnsi="Bodoni MT" w:eastAsia="Microsoft YaHei" w:cs="Bodoni MT"/>
-        </w:rPr>
-      </w:pPr>
-    </w:p>
-    <w:p>
-      <w:pPr>
-        <w:keepNext w:val="0"/>
-        <w:keepLines w:val="0"/>
-        <w:widowControl/>
-        <w:numPr>
-          <w:ilvl w:val="0"/>
-          <w:numId w:val="11"/>
-        </w:numPr>
-        <w:suppressLineNumbers w:val="0"/>
-        <w:spacing w:before="0" w:beforeAutospacing="0" w:after="0" w:afterAutospacing="0" w:line="360" w:lineRule="auto"/>
-        <w:ind w:left="420" w:leftChars="0" w:right="0" w:hanging="420" w:firstLineChars="0"/>
-        <w:jc w:val="left"/>
-        <w:rPr>
-          <w:rFonts w:hint="default" w:ascii="Bodoni MT" w:hAnsi="Bodoni MT" w:eastAsia="Microsoft YaHei" w:cs="Bodoni MT"/>
-        </w:rPr>
-      </w:pPr>
-      <w:r>
-        <w:rPr>
-          <w:rFonts w:hint="default" w:ascii="Bodoni MT" w:hAnsi="Bodoni MT" w:eastAsia="Microsoft YaHei" w:cs="Bodoni MT"/>
-          <w:b w:val="0"/>
-          <w:bCs w:val="0"/>
-          <w:color w:val="auto"/>
-          <w:kern w:val="0"/>
-          <w:sz w:val="22"/>
-          <w:szCs w:val="22"/>
-          <w:lang w:val="en-IN" w:eastAsia="zh-CN" w:bidi="ar"/>
-        </w:rPr>
-        <w:t>F</w:t>
-      </w:r>
-    </w:p>
-    <w:p>
-      <w:pPr>
         <w:rPr>
           <w:rFonts w:hint="default" w:ascii="Bodoni MT" w:hAnsi="Bodoni MT" w:eastAsia="Microsoft YaHei" w:cs="Bodoni MT"/>
         </w:rPr>
@@ -27190,7 +27155,7 @@
           <w:rFonts w:hint="default" w:ascii="Bodoni MT" w:hAnsi="Bodoni MT" w:cs="Bodoni MT"/>
           <w:lang w:val="en-IN"/>
         </w:rPr>
-        <w:t>In real, docker does the below</w:t>
+        <w:t>In real, docker does the below.</w:t>
       </w:r>
       <w:r>
         <w:rPr>
@@ -27211,24 +27176,45 @@
           <w:rFonts w:hint="default" w:ascii="Bodoni MT" w:hAnsi="Bodoni MT" w:cs="Bodoni MT"/>
           <w:i/>
           <w:iCs/>
-          <w:lang w:val="en-IN"/>
-        </w:rPr>
-        <w:t>memory.max, cpu.max</w:t>
-      </w:r>
-      <w:r>
-        <w:rPr>
-          <w:rFonts w:hint="default" w:ascii="Bodoni MT" w:hAnsi="Bodoni MT" w:cs="Bodoni MT"/>
-          <w:i w:val="0"/>
-          <w:iCs w:val="0"/>
-          <w:lang w:val="en-IN"/>
-        </w:rPr>
-        <w:t xml:space="preserve"> and track processes </w:t>
+          <w:u w:val="single"/>
+          <w:lang w:val="en-IN"/>
+        </w:rPr>
+        <w:t>memory.max</w:t>
       </w:r>
       <w:r>
         <w:rPr>
           <w:rFonts w:hint="default" w:ascii="Bodoni MT" w:hAnsi="Bodoni MT" w:cs="Bodoni MT"/>
           <w:i/>
           <w:iCs/>
+          <w:lang w:val="en-IN"/>
+        </w:rPr>
+        <w:t xml:space="preserve">, </w:t>
+      </w:r>
+      <w:r>
+        <w:rPr>
+          <w:rFonts w:hint="default" w:ascii="Bodoni MT" w:hAnsi="Bodoni MT" w:cs="Bodoni MT"/>
+          <w:i/>
+          <w:iCs/>
+          <w:u w:val="single"/>
+          <w:lang w:val="en-IN"/>
+        </w:rPr>
+        <w:t>cpu.max</w:t>
+      </w:r>
+      <w:r>
+        <w:rPr>
+          <w:rFonts w:hint="default" w:ascii="Bodoni MT" w:hAnsi="Bodoni MT" w:cs="Bodoni MT"/>
+          <w:i w:val="0"/>
+          <w:iCs w:val="0"/>
+          <w:lang w:val="en-IN"/>
+        </w:rPr>
+        <w:t xml:space="preserve"> and track processes </w:t>
+      </w:r>
+      <w:r>
+        <w:rPr>
+          <w:rFonts w:hint="default" w:ascii="Bodoni MT" w:hAnsi="Bodoni MT" w:cs="Bodoni MT"/>
+          <w:i/>
+          <w:iCs/>
+          <w:u w:val="single"/>
           <w:lang w:val="en-IN"/>
         </w:rPr>
         <w:t>cgroup.procs</w:t>
@@ -28066,12 +28052,12 @@
         <w:keepLines w:val="0"/>
         <w:widowControl/>
         <w:numPr>
-          <w:ilvl w:val="0"/>
-          <w:numId w:val="11"/>
-        </w:numPr>
-        <w:suppressLineNumbers w:val="0"/>
-        <w:spacing w:before="0" w:beforeAutospacing="0" w:after="0" w:afterAutospacing="0" w:line="360" w:lineRule="auto"/>
-        <w:ind w:left="420" w:leftChars="0" w:right="0" w:hanging="420" w:firstLineChars="0"/>
+          <w:ilvl w:val="1"/>
+          <w:numId w:val="11"/>
+        </w:numPr>
+        <w:suppressLineNumbers w:val="0"/>
+        <w:spacing w:before="0" w:beforeAutospacing="0" w:after="0" w:afterAutospacing="0" w:line="360" w:lineRule="auto"/>
+        <w:ind w:left="840" w:leftChars="0" w:right="0" w:hanging="420" w:firstLineChars="0"/>
         <w:jc w:val="left"/>
         <w:rPr>
           <w:rFonts w:hint="default" w:ascii="Bodoni MT" w:hAnsi="Bodoni MT" w:eastAsia="Microsoft YaHei" w:cs="Bodoni MT"/>
@@ -29572,6 +29558,7 @@
           <w:rFonts w:hint="default" w:ascii="Bodoni MT" w:hAnsi="Bodoni MT" w:eastAsia="Microsoft YaHei" w:cs="Bodoni MT"/>
           <w:b/>
           <w:bCs/>
+          <w:shd w:val="clear" w:color="FFFFFF" w:fill="D9D9D9"/>
           <w:lang w:val="en-IN"/>
         </w:rPr>
         <w:t>NodePort</w:t>
@@ -29581,9 +29568,19 @@
           <w:rFonts w:hint="default" w:ascii="Bodoni MT" w:hAnsi="Bodoni MT" w:eastAsia="Microsoft YaHei" w:cs="Bodoni MT"/>
           <w:b w:val="0"/>
           <w:bCs w:val="0"/>
-          <w:lang w:val="en-IN"/>
-        </w:rPr>
-        <w:t xml:space="preserve"> type of Service can also be used for internal (Pod to Pod) communication but not preferred  (because it contains port and targetPort; for external traffic </w:t>
+          <w:shd w:val="clear" w:color="FFFFFF" w:fill="D9D9D9"/>
+          <w:lang w:val="en-IN"/>
+        </w:rPr>
+        <w:t xml:space="preserve"> type of Service can also be used for internal (Pod to Pod) communication</w:t>
+      </w:r>
+      <w:r>
+        <w:rPr>
+          <w:rFonts w:hint="default" w:ascii="Bodoni MT" w:hAnsi="Bodoni MT" w:eastAsia="Microsoft YaHei" w:cs="Bodoni MT"/>
+          <w:b w:val="0"/>
+          <w:bCs w:val="0"/>
+          <w:lang w:val="en-IN"/>
+        </w:rPr>
+        <w:t xml:space="preserve"> but not preferred  (because it contains port and targetPort; for external traffic </w:t>
       </w:r>
       <w:r>
         <w:rPr>
@@ -29616,6 +29613,8 @@
         </w:rPr>
         <w:t>.</w:t>
       </w:r>
+      <w:bookmarkStart w:id="0" w:name="_GoBack"/>
+      <w:bookmarkEnd w:id="0"/>
       <w:r>
         <w:rPr>
           <w:rFonts w:hint="default" w:ascii="Bodoni MT" w:hAnsi="Bodoni MT" w:eastAsia="Microsoft YaHei" w:cs="Bodoni MT"/>
@@ -34927,8 +34926,6 @@
           <w:rFonts w:hint="default" w:ascii="Bodoni MT" w:hAnsi="Bodoni MT" w:eastAsia="Microsoft YaHei" w:cs="Bodoni MT"/>
         </w:rPr>
       </w:pPr>
-      <w:bookmarkStart w:id="0" w:name="_GoBack"/>
-      <w:bookmarkEnd w:id="0"/>
     </w:p>
     <w:sectPr>
       <w:pgSz w:w="11906" w:h="16838"/>
@@ -35642,8 +35639,8 @@
     <w:lsdException w:unhideWhenUsed="0" w:uiPriority="68" w:semiHidden="0" w:name="Medium Grid 2 Accent 1"/>
     <w:lsdException w:unhideWhenUsed="0" w:uiPriority="69" w:semiHidden="0" w:name="Medium Grid 3 Accent 1"/>
     <w:lsdException w:qFormat="1" w:unhideWhenUsed="0" w:uiPriority="70" w:semiHidden="0" w:name="Dark List Accent 1"/>
-    <w:lsdException w:unhideWhenUsed="0" w:uiPriority="71" w:semiHidden="0" w:name="Colorful Shading Accent 1"/>
-    <w:lsdException w:unhideWhenUsed="0" w:uiPriority="72" w:semiHidden="0" w:name="Colorful List Accent 1"/>
+    <w:lsdException w:qFormat="1" w:unhideWhenUsed="0" w:uiPriority="71" w:semiHidden="0" w:name="Colorful Shading Accent 1"/>
+    <w:lsdException w:qFormat="1" w:unhideWhenUsed="0" w:uiPriority="72" w:semiHidden="0" w:name="Colorful List Accent 1"/>
     <w:lsdException w:qFormat="1" w:unhideWhenUsed="0" w:uiPriority="73" w:semiHidden="0" w:name="Colorful Grid Accent 1"/>
     <w:lsdException w:qFormat="1" w:unhideWhenUsed="0" w:uiPriority="60" w:semiHidden="0" w:name="Light Shading Accent 2"/>
     <w:lsdException w:qFormat="1" w:unhideWhenUsed="0" w:uiPriority="61" w:semiHidden="0" w:name="Light List Accent 2"/>
@@ -35656,9 +35653,9 @@
     <w:lsdException w:qFormat="1" w:unhideWhenUsed="0" w:uiPriority="68" w:semiHidden="0" w:name="Medium Grid 2 Accent 2"/>
     <w:lsdException w:qFormat="1" w:unhideWhenUsed="0" w:uiPriority="69" w:semiHidden="0" w:name="Medium Grid 3 Accent 2"/>
     <w:lsdException w:unhideWhenUsed="0" w:uiPriority="70" w:semiHidden="0" w:name="Dark List Accent 2"/>
-    <w:lsdException w:unhideWhenUsed="0" w:uiPriority="71" w:semiHidden="0" w:name="Colorful Shading Accent 2"/>
-    <w:lsdException w:unhideWhenUsed="0" w:uiPriority="72" w:semiHidden="0" w:name="Colorful List Accent 2"/>
-    <w:lsdException w:unhideWhenUsed="0" w:uiPriority="73" w:semiHidden="0" w:name="Colorful Grid Accent 2"/>
+    <w:lsdException w:qFormat="1" w:unhideWhenUsed="0" w:uiPriority="71" w:semiHidden="0" w:name="Colorful Shading Accent 2"/>
+    <w:lsdException w:qFormat="1" w:unhideWhenUsed="0" w:uiPriority="72" w:semiHidden="0" w:name="Colorful List Accent 2"/>
+    <w:lsdException w:qFormat="1" w:unhideWhenUsed="0" w:uiPriority="73" w:semiHidden="0" w:name="Colorful Grid Accent 2"/>
     <w:lsdException w:qFormat="1" w:unhideWhenUsed="0" w:uiPriority="60" w:semiHidden="0" w:name="Light Shading Accent 3"/>
     <w:lsdException w:qFormat="1" w:unhideWhenUsed="0" w:uiPriority="61" w:semiHidden="0" w:name="Light List Accent 3"/>
     <w:lsdException w:qFormat="1" w:unhideWhenUsed="0" w:uiPriority="62" w:semiHidden="0" w:name="Light Grid Accent 3"/>
@@ -35672,7 +35669,7 @@
     <w:lsdException w:qFormat="1" w:unhideWhenUsed="0" w:uiPriority="70" w:semiHidden="0" w:name="Dark List Accent 3"/>
     <w:lsdException w:qFormat="1" w:unhideWhenUsed="0" w:uiPriority="71" w:semiHidden="0" w:name="Colorful Shading Accent 3"/>
     <w:lsdException w:qFormat="1" w:unhideWhenUsed="0" w:uiPriority="72" w:semiHidden="0" w:name="Colorful List Accent 3"/>
-    <w:lsdException w:unhideWhenUsed="0" w:uiPriority="73" w:semiHidden="0" w:name="Colorful Grid Accent 3"/>
+    <w:lsdException w:qFormat="1" w:unhideWhenUsed="0" w:uiPriority="73" w:semiHidden="0" w:name="Colorful Grid Accent 3"/>
     <w:lsdException w:qFormat="1" w:unhideWhenUsed="0" w:uiPriority="60" w:semiHidden="0" w:name="Light Shading Accent 4"/>
     <w:lsdException w:qFormat="1" w:unhideWhenUsed="0" w:uiPriority="61" w:semiHidden="0" w:name="Light List Accent 4"/>
     <w:lsdException w:qFormat="1" w:unhideWhenUsed="0" w:uiPriority="62" w:semiHidden="0" w:name="Light Grid Accent 4"/>
@@ -35685,8 +35682,8 @@
     <w:lsdException w:qFormat="1" w:unhideWhenUsed="0" w:uiPriority="69" w:semiHidden="0" w:name="Medium Grid 3 Accent 4"/>
     <w:lsdException w:unhideWhenUsed="0" w:uiPriority="70" w:semiHidden="0" w:name="Dark List Accent 4"/>
     <w:lsdException w:qFormat="1" w:unhideWhenUsed="0" w:uiPriority="71" w:semiHidden="0" w:name="Colorful Shading Accent 4"/>
-    <w:lsdException w:unhideWhenUsed="0" w:uiPriority="72" w:semiHidden="0" w:name="Colorful List Accent 4"/>
-    <w:lsdException w:unhideWhenUsed="0" w:uiPriority="73" w:semiHidden="0" w:name="Colorful Grid Accent 4"/>
+    <w:lsdException w:qFormat="1" w:unhideWhenUsed="0" w:uiPriority="72" w:semiHidden="0" w:name="Colorful List Accent 4"/>
+    <w:lsdException w:qFormat="1" w:unhideWhenUsed="0" w:uiPriority="73" w:semiHidden="0" w:name="Colorful Grid Accent 4"/>
     <w:lsdException w:qFormat="1" w:unhideWhenUsed="0" w:uiPriority="60" w:semiHidden="0" w:name="Light Shading Accent 5"/>
     <w:lsdException w:qFormat="1" w:unhideWhenUsed="0" w:uiPriority="61" w:semiHidden="0" w:name="Light List Accent 5"/>
     <w:lsdException w:qFormat="1" w:unhideWhenUsed="0" w:uiPriority="62" w:semiHidden="0" w:name="Light Grid Accent 5"/>
@@ -35697,10 +35694,10 @@
     <w:lsdException w:unhideWhenUsed="0" w:uiPriority="67" w:semiHidden="0" w:name="Medium Grid 1 Accent 5"/>
     <w:lsdException w:unhideWhenUsed="0" w:uiPriority="68" w:semiHidden="0" w:name="Medium Grid 2 Accent 5"/>
     <w:lsdException w:unhideWhenUsed="0" w:uiPriority="69" w:semiHidden="0" w:name="Medium Grid 3 Accent 5"/>
-    <w:lsdException w:unhideWhenUsed="0" w:uiPriority="70" w:semiHidden="0" w:name="Dark List Accent 5"/>
+    <w:lsdException w:qFormat="1" w:unhideWhenUsed="0" w:uiPriority="70" w:semiHidden="0" w:name="Dark List Accent 5"/>
     <w:lsdException w:qFormat="1" w:unhideWhenUsed="0" w:uiPriority="71" w:semiHidden="0" w:name="Colorful Shading Accent 5"/>
-    <w:lsdException w:unhideWhenUsed="0" w:uiPriority="72" w:semiHidden="0" w:name="Colorful List Accent 5"/>
-    <w:lsdException w:unhideWhenUsed="0" w:uiPriority="73" w:semiHidden="0" w:name="Colorful Grid Accent 5"/>
+    <w:lsdException w:qFormat="1" w:unhideWhenUsed="0" w:uiPriority="72" w:semiHidden="0" w:name="Colorful List Accent 5"/>
+    <w:lsdException w:qFormat="1" w:unhideWhenUsed="0" w:uiPriority="73" w:semiHidden="0" w:name="Colorful Grid Accent 5"/>
     <w:lsdException w:qFormat="1" w:unhideWhenUsed="0" w:uiPriority="60" w:semiHidden="0" w:name="Light Shading Accent 6"/>
     <w:lsdException w:qFormat="1" w:unhideWhenUsed="0" w:uiPriority="61" w:semiHidden="0" w:name="Light List Accent 6"/>
     <w:lsdException w:qFormat="1" w:unhideWhenUsed="0" w:uiPriority="62" w:semiHidden="0" w:name="Light Grid Accent 6"/>
@@ -35711,10 +35708,10 @@
     <w:lsdException w:qFormat="1" w:unhideWhenUsed="0" w:uiPriority="67" w:semiHidden="0" w:name="Medium Grid 1 Accent 6"/>
     <w:lsdException w:unhideWhenUsed="0" w:uiPriority="68" w:semiHidden="0" w:name="Medium Grid 2 Accent 6"/>
     <w:lsdException w:unhideWhenUsed="0" w:uiPriority="69" w:semiHidden="0" w:name="Medium Grid 3 Accent 6"/>
-    <w:lsdException w:unhideWhenUsed="0" w:uiPriority="70" w:semiHidden="0" w:name="Dark List Accent 6"/>
-    <w:lsdException w:unhideWhenUsed="0" w:uiPriority="71" w:semiHidden="0" w:name="Colorful Shading Accent 6"/>
+    <w:lsdException w:qFormat="1" w:unhideWhenUsed="0" w:uiPriority="70" w:semiHidden="0" w:name="Dark List Accent 6"/>
+    <w:lsdException w:qFormat="1" w:unhideWhenUsed="0" w:uiPriority="71" w:semiHidden="0" w:name="Colorful Shading Accent 6"/>
     <w:lsdException w:qFormat="1" w:unhideWhenUsed="0" w:uiPriority="72" w:semiHidden="0" w:name="Colorful List Accent 6"/>
-    <w:lsdException w:unhideWhenUsed="0" w:uiPriority="73" w:semiHidden="0" w:name="Colorful Grid Accent 6"/>
+    <w:lsdException w:qFormat="1" w:unhideWhenUsed="0" w:uiPriority="73" w:semiHidden="0" w:name="Colorful Grid Accent 6"/>
   </w:latentStyles>
   <w:style w:type="paragraph" w:default="1" w:styleId="1">
     <w:name w:val="Normal"/>
@@ -47628,6 +47625,7 @@
   <w:style w:type="table" w:styleId="226">
     <w:name w:val="Dark List Accent 5"/>
     <w:basedOn w:val="12"/>
+    <w:qFormat/>
     <w:uiPriority w:val="70"/>
     <w:rPr>
       <w:color w:val="FFFFFF"/>
@@ -47731,6 +47729,7 @@
   <w:style w:type="table" w:styleId="227">
     <w:name w:val="Dark List Accent 6"/>
     <w:basedOn w:val="12"/>
+    <w:qFormat/>
     <w:uiPriority w:val="70"/>
     <w:rPr>
       <w:color w:val="FFFFFF"/>
@@ -47944,6 +47943,7 @@
   <w:style w:type="table" w:styleId="229">
     <w:name w:val="Colorful Shading Accent 1"/>
     <w:basedOn w:val="12"/>
+    <w:qFormat/>
     <w:uiPriority w:val="71"/>
     <w:rPr>
       <w:color w:val="000000"/>
@@ -48053,6 +48053,7 @@
   <w:style w:type="table" w:styleId="230">
     <w:name w:val="Colorful Shading Accent 2"/>
     <w:basedOn w:val="12"/>
+    <w:qFormat/>
     <w:uiPriority w:val="71"/>
     <w:rPr>
       <w:color w:val="000000"/>
@@ -48482,6 +48483,7 @@
   <w:style w:type="table" w:styleId="234">
     <w:name w:val="Colorful Shading Accent 6"/>
     <w:basedOn w:val="12"/>
+    <w:qFormat/>
     <w:uiPriority w:val="71"/>
     <w:rPr>
       <w:color w:val="000000"/>
@@ -48667,6 +48669,7 @@
   <w:style w:type="table" w:styleId="236">
     <w:name w:val="Colorful List Accent 1"/>
     <w:basedOn w:val="12"/>
+    <w:qFormat/>
     <w:uiPriority w:val="72"/>
     <w:rPr>
       <w:color w:val="000000"/>
@@ -48742,6 +48745,7 @@
   <w:style w:type="table" w:styleId="237">
     <w:name w:val="Colorful List Accent 2"/>
     <w:basedOn w:val="12"/>
+    <w:qFormat/>
     <w:uiPriority w:val="72"/>
     <w:rPr>
       <w:color w:val="000000"/>
@@ -48893,6 +48897,7 @@
   <w:style w:type="table" w:styleId="239">
     <w:name w:val="Colorful List Accent 4"/>
     <w:basedOn w:val="12"/>
+    <w:qFormat/>
     <w:uiPriority w:val="72"/>
     <w:rPr>
       <w:color w:val="000000"/>
@@ -48968,6 +48973,7 @@
   <w:style w:type="table" w:styleId="240">
     <w:name w:val="Colorful List Accent 5"/>
     <w:basedOn w:val="12"/>
+    <w:qFormat/>
     <w:uiPriority w:val="72"/>
     <w:rPr>
       <w:color w:val="000000"/>
@@ -49255,6 +49261,7 @@
   <w:style w:type="table" w:styleId="244">
     <w:name w:val="Colorful Grid Accent 2"/>
     <w:basedOn w:val="12"/>
+    <w:qFormat/>
     <w:uiPriority w:val="73"/>
     <w:rPr>
       <w:color w:val="000000"/>
@@ -49322,6 +49329,7 @@
   <w:style w:type="table" w:styleId="245">
     <w:name w:val="Colorful Grid Accent 3"/>
     <w:basedOn w:val="12"/>
+    <w:qFormat/>
     <w:uiPriority w:val="73"/>
     <w:rPr>
       <w:color w:val="000000"/>
@@ -49389,6 +49397,7 @@
   <w:style w:type="table" w:styleId="246">
     <w:name w:val="Colorful Grid Accent 4"/>
     <w:basedOn w:val="12"/>
+    <w:qFormat/>
     <w:uiPriority w:val="73"/>
     <w:rPr>
       <w:color w:val="000000"/>
@@ -49456,6 +49465,7 @@
   <w:style w:type="table" w:styleId="247">
     <w:name w:val="Colorful Grid Accent 5"/>
     <w:basedOn w:val="12"/>
+    <w:qFormat/>
     <w:uiPriority w:val="73"/>
     <w:rPr>
       <w:color w:val="000000"/>
@@ -49523,6 +49533,7 @@
   <w:style w:type="table" w:styleId="248">
     <w:name w:val="Colorful Grid Accent 6"/>
     <w:basedOn w:val="12"/>
+    <w:qFormat/>
     <w:uiPriority w:val="73"/>
     <w:rPr>
       <w:color w:val="000000"/>

</xml_diff>

<commit_message>
created a summary doc to write the things in short. not done yet
</commit_message>
<xml_diff>
--- a/docs (kubernetes)/kubernetes_for_absolute_beginners_kodekloud.docx
+++ b/docs (kubernetes)/kubernetes_for_absolute_beginners_kodekloud.docx
@@ -6284,77 +6284,6 @@
       <w:r>
         <w:rPr>
           <w:rFonts w:hint="default" w:ascii="Bodoni MT" w:hAnsi="Bodoni MT" w:eastAsia="Microsoft YaHei" w:cs="Bodoni MT"/>
-        </w:rPr>
-        <w:drawing>
-          <wp:inline distT="0" distB="0" distL="114300" distR="114300">
-            <wp:extent cx="943610" cy="312420"/>
-            <wp:effectExtent l="0" t="0" r="8890" b="5080"/>
-            <wp:docPr id="19" name="Picture 6"/>
-            <wp:cNvGraphicFramePr>
-              <a:graphicFrameLocks xmlns:a="http://schemas.openxmlformats.org/drawingml/2006/main" noChangeAspect="1"/>
-            </wp:cNvGraphicFramePr>
-            <a:graphic xmlns:a="http://schemas.openxmlformats.org/drawingml/2006/main">
-              <a:graphicData uri="http://schemas.openxmlformats.org/drawingml/2006/picture">
-                <pic:pic xmlns:pic="http://schemas.openxmlformats.org/drawingml/2006/picture">
-                  <pic:nvPicPr>
-                    <pic:cNvPr id="19" name="Picture 6"/>
-                    <pic:cNvPicPr>
-                      <a:picLocks noChangeAspect="1"/>
-                    </pic:cNvPicPr>
-                  </pic:nvPicPr>
-                  <pic:blipFill>
-                    <a:blip r:embed="rId20"/>
-                    <a:stretch>
-                      <a:fillRect/>
-                    </a:stretch>
-                  </pic:blipFill>
-                  <pic:spPr>
-                    <a:xfrm>
-                      <a:off x="0" y="0"/>
-                      <a:ext cx="943610" cy="312420"/>
-                    </a:xfrm>
-                    <a:prstGeom prst="rect">
-                      <a:avLst/>
-                    </a:prstGeom>
-                    <a:noFill/>
-                    <a:ln>
-                      <a:noFill/>
-                    </a:ln>
-                  </pic:spPr>
-                </pic:pic>
-              </a:graphicData>
-            </a:graphic>
-          </wp:inline>
-        </w:drawing>
-      </w:r>
-      <w:r>
-        <w:rPr>
-          <w:rFonts w:hint="default" w:ascii="Bodoni MT" w:hAnsi="Bodoni MT" w:eastAsia="Microsoft YaHei" w:cs="Bodoni MT"/>
-          <w:lang w:val="en-IN"/>
-        </w:rPr>
-        <w:t>, it says -- I want 3 pods running.</w:t>
-      </w:r>
-    </w:p>
-    <w:p>
-      <w:pPr>
-        <w:keepNext w:val="0"/>
-        <w:keepLines w:val="0"/>
-        <w:widowControl/>
-        <w:numPr>
-          <w:ilvl w:val="2"/>
-          <w:numId w:val="11"/>
-        </w:numPr>
-        <w:suppressLineNumbers w:val="0"/>
-        <w:spacing w:before="0" w:beforeAutospacing="0" w:after="0" w:afterAutospacing="0" w:line="360" w:lineRule="auto"/>
-        <w:ind w:left="1260" w:leftChars="0" w:right="0" w:hanging="420" w:firstLineChars="0"/>
-        <w:jc w:val="left"/>
-        <w:rPr>
-          <w:rFonts w:hint="default" w:ascii="Bodoni MT" w:hAnsi="Bodoni MT" w:eastAsia="Microsoft YaHei" w:cs="Bodoni MT"/>
-        </w:rPr>
-      </w:pPr>
-      <w:r>
-        <w:rPr>
-          <w:rFonts w:hint="default" w:ascii="Bodoni MT" w:hAnsi="Bodoni MT" w:eastAsia="Microsoft YaHei" w:cs="Bodoni MT"/>
           <w:lang w:val="en-IN"/>
         </w:rPr>
         <w:t>Specs defines: which container? which image? how it should run?</w:t>
@@ -6579,7 +6508,7 @@
                     </pic:cNvPicPr>
                   </pic:nvPicPr>
                   <pic:blipFill>
-                    <a:blip r:embed="rId21"/>
+                    <a:blip r:embed="rId20"/>
                     <a:stretch>
                       <a:fillRect/>
                     </a:stretch>
@@ -7666,7 +7595,7 @@
                     </pic:cNvPicPr>
                   </pic:nvPicPr>
                   <pic:blipFill>
-                    <a:blip r:embed="rId22"/>
+                    <a:blip r:embed="rId21"/>
                     <a:srcRect l="9863" t="15752" r="26115" b="18560"/>
                     <a:stretch>
                       <a:fillRect/>
@@ -7731,7 +7660,7 @@
                     </pic:cNvPicPr>
                   </pic:nvPicPr>
                   <pic:blipFill>
-                    <a:blip r:embed="rId23"/>
+                    <a:blip r:embed="rId22"/>
                     <a:stretch>
                       <a:fillRect/>
                     </a:stretch>
@@ -8242,7 +8171,7 @@
                     </pic:cNvPicPr>
                   </pic:nvPicPr>
                   <pic:blipFill>
-                    <a:blip r:embed="rId24"/>
+                    <a:blip r:embed="rId23"/>
                     <a:stretch>
                       <a:fillRect/>
                     </a:stretch>
@@ -9012,7 +8941,7 @@
                     </pic:cNvPicPr>
                   </pic:nvPicPr>
                   <pic:blipFill>
-                    <a:blip r:embed="rId25"/>
+                    <a:blip r:embed="rId24"/>
                     <a:stretch>
                       <a:fillRect/>
                     </a:stretch>
@@ -9107,7 +9036,7 @@
                     </pic:cNvPicPr>
                   </pic:nvPicPr>
                   <pic:blipFill>
-                    <a:blip r:embed="rId26"/>
+                    <a:blip r:embed="rId25"/>
                     <a:stretch>
                       <a:fillRect/>
                     </a:stretch>
@@ -9840,7 +9769,7 @@
                     </pic:cNvPicPr>
                   </pic:nvPicPr>
                   <pic:blipFill>
-                    <a:blip r:embed="rId27"/>
+                    <a:blip r:embed="rId26"/>
                     <a:stretch>
                       <a:fillRect/>
                     </a:stretch>
@@ -9943,7 +9872,7 @@
                     </pic:cNvPicPr>
                   </pic:nvPicPr>
                   <pic:blipFill>
-                    <a:blip r:embed="rId28"/>
+                    <a:blip r:embed="rId27"/>
                     <a:srcRect l="3417" t="9168" r="45947" b="84381"/>
                     <a:stretch>
                       <a:fillRect/>
@@ -10014,7 +9943,7 @@
                     </pic:cNvPicPr>
                   </pic:nvPicPr>
                   <pic:blipFill>
-                    <a:blip r:embed="rId28"/>
+                    <a:blip r:embed="rId27"/>
                     <a:srcRect l="3467" t="9191" r="46770" b="84381"/>
                     <a:stretch>
                       <a:fillRect/>
@@ -10085,7 +10014,7 @@
                     </pic:cNvPicPr>
                   </pic:nvPicPr>
                   <pic:blipFill>
-                    <a:blip r:embed="rId28"/>
+                    <a:blip r:embed="rId27"/>
                     <a:srcRect t="40014" b="42317"/>
                     <a:stretch>
                       <a:fillRect/>
@@ -10156,7 +10085,7 @@
                     </pic:cNvPicPr>
                   </pic:nvPicPr>
                   <pic:blipFill>
-                    <a:blip r:embed="rId28"/>
+                    <a:blip r:embed="rId27"/>
                     <a:srcRect t="71504" r="44899" b="21424"/>
                     <a:stretch>
                       <a:fillRect/>
@@ -10227,7 +10156,7 @@
                     </pic:cNvPicPr>
                   </pic:nvPicPr>
                   <pic:blipFill>
-                    <a:blip r:embed="rId28"/>
+                    <a:blip r:embed="rId27"/>
                     <a:srcRect l="3592" t="92099" r="34173"/>
                     <a:stretch>
                       <a:fillRect/>
@@ -10722,7 +10651,7 @@
                     </pic:cNvPicPr>
                   </pic:nvPicPr>
                   <pic:blipFill>
-                    <a:blip r:embed="rId29"/>
+                    <a:blip r:embed="rId28"/>
                     <a:stretch>
                       <a:fillRect/>
                     </a:stretch>
@@ -10845,7 +10774,7 @@
                     </pic:cNvPicPr>
                   </pic:nvPicPr>
                   <pic:blipFill>
-                    <a:blip r:embed="rId30"/>
+                    <a:blip r:embed="rId29"/>
                     <a:stretch>
                       <a:fillRect/>
                     </a:stretch>
@@ -10898,7 +10827,7 @@
                     </pic:cNvPicPr>
                   </pic:nvPicPr>
                   <pic:blipFill>
-                    <a:blip r:embed="rId31"/>
+                    <a:blip r:embed="rId30"/>
                     <a:stretch>
                       <a:fillRect/>
                     </a:stretch>
@@ -11026,7 +10955,7 @@
                     </pic:cNvPicPr>
                   </pic:nvPicPr>
                   <pic:blipFill>
-                    <a:blip r:embed="rId32"/>
+                    <a:blip r:embed="rId31"/>
                     <a:stretch>
                       <a:fillRect/>
                     </a:stretch>
@@ -11168,7 +11097,7 @@
                     </pic:cNvPicPr>
                   </pic:nvPicPr>
                   <pic:blipFill>
-                    <a:blip r:embed="rId33"/>
+                    <a:blip r:embed="rId32"/>
                     <a:stretch>
                       <a:fillRect/>
                     </a:stretch>
@@ -11307,7 +11236,7 @@
                     </pic:cNvPicPr>
                   </pic:nvPicPr>
                   <pic:blipFill>
-                    <a:blip r:embed="rId34"/>
+                    <a:blip r:embed="rId33"/>
                     <a:stretch>
                       <a:fillRect/>
                     </a:stretch>
@@ -11359,7 +11288,7 @@
                     </pic:cNvPicPr>
                   </pic:nvPicPr>
                   <pic:blipFill>
-                    <a:blip r:embed="rId35"/>
+                    <a:blip r:embed="rId34"/>
                     <a:stretch>
                       <a:fillRect/>
                     </a:stretch>
@@ -11491,7 +11420,7 @@
                     </pic:cNvPicPr>
                   </pic:nvPicPr>
                   <pic:blipFill>
-                    <a:blip r:embed="rId36"/>
+                    <a:blip r:embed="rId35"/>
                     <a:stretch>
                       <a:fillRect/>
                     </a:stretch>
@@ -11569,7 +11498,7 @@
                     </pic:cNvPicPr>
                   </pic:nvPicPr>
                   <pic:blipFill>
-                    <a:blip r:embed="rId37"/>
+                    <a:blip r:embed="rId36"/>
                     <a:stretch>
                       <a:fillRect/>
                     </a:stretch>
@@ -11887,7 +11816,7 @@
                     </pic:cNvPicPr>
                   </pic:nvPicPr>
                   <pic:blipFill>
-                    <a:blip r:embed="rId38"/>
+                    <a:blip r:embed="rId37"/>
                     <a:stretch>
                       <a:fillRect/>
                     </a:stretch>
@@ -11991,7 +11920,7 @@
                     </pic:cNvPicPr>
                   </pic:nvPicPr>
                   <pic:blipFill>
-                    <a:blip r:embed="rId39"/>
+                    <a:blip r:embed="rId38"/>
                     <a:stretch>
                       <a:fillRect/>
                     </a:stretch>
@@ -12762,7 +12691,7 @@
                     </pic:cNvPicPr>
                   </pic:nvPicPr>
                   <pic:blipFill>
-                    <a:blip r:embed="rId40"/>
+                    <a:blip r:embed="rId39"/>
                     <a:srcRect l="9959" t="5144" r="11647" b="42349"/>
                     <a:stretch>
                       <a:fillRect/>
@@ -13167,7 +13096,7 @@
                     </pic:cNvPicPr>
                   </pic:nvPicPr>
                   <pic:blipFill>
-                    <a:blip r:embed="rId41"/>
+                    <a:blip r:embed="rId40"/>
                     <a:stretch>
                       <a:fillRect/>
                     </a:stretch>
@@ -13358,7 +13287,7 @@
                     </pic:cNvPicPr>
                   </pic:nvPicPr>
                   <pic:blipFill>
-                    <a:blip r:embed="rId42"/>
+                    <a:blip r:embed="rId41"/>
                     <a:stretch>
                       <a:fillRect/>
                     </a:stretch>
@@ -13625,7 +13554,7 @@
                     </pic:cNvPicPr>
                   </pic:nvPicPr>
                   <pic:blipFill>
-                    <a:blip r:embed="rId43"/>
+                    <a:blip r:embed="rId42"/>
                     <a:stretch>
                       <a:fillRect/>
                     </a:stretch>
@@ -13978,7 +13907,7 @@
                     </pic:cNvPicPr>
                   </pic:nvPicPr>
                   <pic:blipFill>
-                    <a:blip r:embed="rId44"/>
+                    <a:blip r:embed="rId43"/>
                     <a:stretch>
                       <a:fillRect/>
                     </a:stretch>
@@ -14042,7 +13971,7 @@
                     </pic:cNvPicPr>
                   </pic:nvPicPr>
                   <pic:blipFill>
-                    <a:blip r:embed="rId45"/>
+                    <a:blip r:embed="rId44"/>
                     <a:stretch>
                       <a:fillRect/>
                     </a:stretch>
@@ -14088,7 +14017,7 @@
                     </pic:cNvPicPr>
                   </pic:nvPicPr>
                   <pic:blipFill>
-                    <a:blip r:embed="rId46"/>
+                    <a:blip r:embed="rId45"/>
                     <a:stretch>
                       <a:fillRect/>
                     </a:stretch>
@@ -14519,7 +14448,7 @@
                     </pic:cNvPicPr>
                   </pic:nvPicPr>
                   <pic:blipFill>
-                    <a:blip r:embed="rId47"/>
+                    <a:blip r:embed="rId46"/>
                     <a:stretch>
                       <a:fillRect/>
                     </a:stretch>
@@ -14585,7 +14514,7 @@
                     </pic:cNvPicPr>
                   </pic:nvPicPr>
                   <pic:blipFill>
-                    <a:blip r:embed="rId48"/>
+                    <a:blip r:embed="rId47"/>
                     <a:stretch>
                       <a:fillRect/>
                     </a:stretch>
@@ -14830,7 +14759,7 @@
                     </pic:cNvPicPr>
                   </pic:nvPicPr>
                   <pic:blipFill>
-                    <a:blip r:embed="rId49"/>
+                    <a:blip r:embed="rId48"/>
                     <a:stretch>
                       <a:fillRect/>
                     </a:stretch>
@@ -14896,7 +14825,7 @@
                     </pic:cNvPicPr>
                   </pic:nvPicPr>
                   <pic:blipFill>
-                    <a:blip r:embed="rId50"/>
+                    <a:blip r:embed="rId49"/>
                     <a:stretch>
                       <a:fillRect/>
                     </a:stretch>
@@ -15375,7 +15304,7 @@
                     </pic:cNvPicPr>
                   </pic:nvPicPr>
                   <pic:blipFill>
-                    <a:blip r:embed="rId51"/>
+                    <a:blip r:embed="rId50"/>
                     <a:srcRect l="591" t="30111" r="3798" b="19203"/>
                     <a:stretch>
                       <a:fillRect/>
@@ -15596,7 +15525,7 @@
                     </pic:cNvPicPr>
                   </pic:nvPicPr>
                   <pic:blipFill>
-                    <a:blip r:embed="rId52"/>
+                    <a:blip r:embed="rId51"/>
                     <a:stretch>
                       <a:fillRect/>
                     </a:stretch>
@@ -15648,7 +15577,7 @@
                     </pic:cNvPicPr>
                   </pic:nvPicPr>
                   <pic:blipFill>
-                    <a:blip r:embed="rId53"/>
+                    <a:blip r:embed="rId52"/>
                     <a:stretch>
                       <a:fillRect/>
                     </a:stretch>
@@ -15772,7 +15701,7 @@
                     </pic:cNvPicPr>
                   </pic:nvPicPr>
                   <pic:blipFill>
-                    <a:blip r:embed="rId54"/>
+                    <a:blip r:embed="rId53"/>
                     <a:stretch>
                       <a:fillRect/>
                     </a:stretch>
@@ -15836,7 +15765,7 @@
                     </pic:cNvPicPr>
                   </pic:nvPicPr>
                   <pic:blipFill>
-                    <a:blip r:embed="rId55"/>
+                    <a:blip r:embed="rId54"/>
                     <a:stretch>
                       <a:fillRect/>
                     </a:stretch>
@@ -16023,7 +15952,7 @@
                     </pic:cNvPicPr>
                   </pic:nvPicPr>
                   <pic:blipFill>
-                    <a:blip r:embed="rId56"/>
+                    <a:blip r:embed="rId55"/>
                     <a:stretch>
                       <a:fillRect/>
                     </a:stretch>
@@ -16075,7 +16004,7 @@
                     </pic:cNvPicPr>
                   </pic:nvPicPr>
                   <pic:blipFill>
-                    <a:blip r:embed="rId57"/>
+                    <a:blip r:embed="rId56"/>
                     <a:stretch>
                       <a:fillRect/>
                     </a:stretch>
@@ -16189,7 +16118,7 @@
                     </pic:cNvPicPr>
                   </pic:nvPicPr>
                   <pic:blipFill>
-                    <a:blip r:embed="rId58"/>
+                    <a:blip r:embed="rId57"/>
                     <a:stretch>
                       <a:fillRect/>
                     </a:stretch>
@@ -16278,7 +16207,7 @@
                     </pic:cNvPicPr>
                   </pic:nvPicPr>
                   <pic:blipFill>
-                    <a:blip r:embed="rId59"/>
+                    <a:blip r:embed="rId58"/>
                     <a:stretch>
                       <a:fillRect/>
                     </a:stretch>
@@ -16412,7 +16341,7 @@
                     </pic:cNvPicPr>
                   </pic:nvPicPr>
                   <pic:blipFill>
-                    <a:blip r:embed="rId60"/>
+                    <a:blip r:embed="rId59"/>
                     <a:stretch>
                       <a:fillRect/>
                     </a:stretch>
@@ -16501,7 +16430,7 @@
                     </pic:cNvPicPr>
                   </pic:nvPicPr>
                   <pic:blipFill>
-                    <a:blip r:embed="rId61"/>
+                    <a:blip r:embed="rId60"/>
                     <a:stretch>
                       <a:fillRect/>
                     </a:stretch>
@@ -16608,7 +16537,7 @@
                     </pic:cNvPicPr>
                   </pic:nvPicPr>
                   <pic:blipFill>
-                    <a:blip r:embed="rId62"/>
+                    <a:blip r:embed="rId61"/>
                     <a:stretch>
                       <a:fillRect/>
                     </a:stretch>
@@ -16729,7 +16658,7 @@
                     </pic:cNvPicPr>
                   </pic:nvPicPr>
                   <pic:blipFill>
-                    <a:blip r:embed="rId63"/>
+                    <a:blip r:embed="rId62"/>
                     <a:stretch>
                       <a:fillRect/>
                     </a:stretch>
@@ -17253,7 +17182,7 @@
                     </pic:cNvPicPr>
                   </pic:nvPicPr>
                   <pic:blipFill>
-                    <a:blip r:embed="rId64"/>
+                    <a:blip r:embed="rId63"/>
                     <a:stretch>
                       <a:fillRect/>
                     </a:stretch>
@@ -17328,7 +17257,7 @@
                     </pic:cNvPicPr>
                   </pic:nvPicPr>
                   <pic:blipFill>
-                    <a:blip r:embed="rId65"/>
+                    <a:blip r:embed="rId64"/>
                     <a:stretch>
                       <a:fillRect/>
                     </a:stretch>
@@ -17445,7 +17374,7 @@
                     </pic:cNvPicPr>
                   </pic:nvPicPr>
                   <pic:blipFill>
-                    <a:blip r:embed="rId66"/>
+                    <a:blip r:embed="rId65"/>
                     <a:stretch>
                       <a:fillRect/>
                     </a:stretch>
@@ -17552,7 +17481,7 @@
                     </pic:cNvPicPr>
                   </pic:nvPicPr>
                   <pic:blipFill>
-                    <a:blip r:embed="rId67"/>
+                    <a:blip r:embed="rId66"/>
                     <a:stretch>
                       <a:fillRect/>
                     </a:stretch>
@@ -17667,7 +17596,7 @@
                     </pic:cNvPicPr>
                   </pic:nvPicPr>
                   <pic:blipFill>
-                    <a:blip r:embed="rId68"/>
+                    <a:blip r:embed="rId67"/>
                     <a:stretch>
                       <a:fillRect/>
                     </a:stretch>
@@ -17895,7 +17824,7 @@
                     </pic:cNvPicPr>
                   </pic:nvPicPr>
                   <pic:blipFill>
-                    <a:blip r:embed="rId69"/>
+                    <a:blip r:embed="rId68"/>
                     <a:stretch>
                       <a:fillRect/>
                     </a:stretch>
@@ -17959,7 +17888,7 @@
                     </pic:cNvPicPr>
                   </pic:nvPicPr>
                   <pic:blipFill>
-                    <a:blip r:embed="rId70"/>
+                    <a:blip r:embed="rId69"/>
                     <a:stretch>
                       <a:fillRect/>
                     </a:stretch>
@@ -18140,7 +18069,7 @@
                     </pic:cNvPicPr>
                   </pic:nvPicPr>
                   <pic:blipFill>
-                    <a:blip r:embed="rId71"/>
+                    <a:blip r:embed="rId70"/>
                     <a:stretch>
                       <a:fillRect/>
                     </a:stretch>
@@ -18230,7 +18159,7 @@
                     </pic:cNvPicPr>
                   </pic:nvPicPr>
                   <pic:blipFill>
-                    <a:blip r:embed="rId72"/>
+                    <a:blip r:embed="rId71"/>
                     <a:stretch>
                       <a:fillRect/>
                     </a:stretch>
@@ -18334,7 +18263,7 @@
                     </pic:cNvPicPr>
                   </pic:nvPicPr>
                   <pic:blipFill>
-                    <a:blip r:embed="rId73"/>
+                    <a:blip r:embed="rId72"/>
                     <a:stretch>
                       <a:fillRect/>
                     </a:stretch>
@@ -18975,7 +18904,7 @@
                     </pic:cNvPicPr>
                   </pic:nvPicPr>
                   <pic:blipFill>
-                    <a:blip r:embed="rId74"/>
+                    <a:blip r:embed="rId73"/>
                     <a:stretch>
                       <a:fillRect/>
                     </a:stretch>
@@ -19238,7 +19167,7 @@
                     </pic:cNvPicPr>
                   </pic:nvPicPr>
                   <pic:blipFill>
-                    <a:blip r:embed="rId75"/>
+                    <a:blip r:embed="rId74"/>
                     <a:stretch>
                       <a:fillRect/>
                     </a:stretch>
@@ -19352,7 +19281,7 @@
                     </pic:cNvPicPr>
                   </pic:nvPicPr>
                   <pic:blipFill>
-                    <a:blip r:embed="rId76"/>
+                    <a:blip r:embed="rId75"/>
                     <a:srcRect l="16024" t="30990" r="15023" b="36648"/>
                     <a:stretch>
                       <a:fillRect/>
@@ -19497,7 +19426,7 @@
                     </pic:cNvPicPr>
                   </pic:nvPicPr>
                   <pic:blipFill>
-                    <a:blip r:embed="rId77"/>
+                    <a:blip r:embed="rId76"/>
                     <a:stretch>
                       <a:fillRect/>
                     </a:stretch>
@@ -19722,7 +19651,7 @@
                     </pic:cNvPicPr>
                   </pic:nvPicPr>
                   <pic:blipFill>
-                    <a:blip r:embed="rId78"/>
+                    <a:blip r:embed="rId77"/>
                     <a:stretch>
                       <a:fillRect/>
                     </a:stretch>
@@ -20407,7 +20336,7 @@
                     </pic:cNvPicPr>
                   </pic:nvPicPr>
                   <pic:blipFill>
-                    <a:blip r:embed="rId79"/>
+                    <a:blip r:embed="rId78"/>
                     <a:stretch>
                       <a:fillRect/>
                     </a:stretch>
@@ -20460,7 +20389,7 @@
                     </pic:cNvPicPr>
                   </pic:nvPicPr>
                   <pic:blipFill>
-                    <a:blip r:embed="rId80"/>
+                    <a:blip r:embed="rId79"/>
                     <a:stretch>
                       <a:fillRect/>
                     </a:stretch>
@@ -21440,7 +21369,7 @@
                     </pic:cNvPicPr>
                   </pic:nvPicPr>
                   <pic:blipFill>
-                    <a:blip r:embed="rId81"/>
+                    <a:blip r:embed="rId80"/>
                     <a:stretch>
                       <a:fillRect/>
                     </a:stretch>
@@ -21500,7 +21429,7 @@
                     </pic:cNvPicPr>
                   </pic:nvPicPr>
                   <pic:blipFill>
-                    <a:blip r:embed="rId82"/>
+                    <a:blip r:embed="rId81"/>
                     <a:stretch>
                       <a:fillRect/>
                     </a:stretch>
@@ -21593,7 +21522,7 @@
                     </pic:cNvPicPr>
                   </pic:nvPicPr>
                   <pic:blipFill>
-                    <a:blip r:embed="rId83"/>
+                    <a:blip r:embed="rId82"/>
                     <a:stretch>
                       <a:fillRect/>
                     </a:stretch>
@@ -21811,7 +21740,7 @@
                     </pic:cNvPicPr>
                   </pic:nvPicPr>
                   <pic:blipFill>
-                    <a:blip r:embed="rId84"/>
+                    <a:blip r:embed="rId83"/>
                     <a:srcRect l="17577" t="25652" r="32409" b="11444"/>
                     <a:stretch>
                       <a:fillRect/>
@@ -21934,7 +21863,7 @@
                     </pic:cNvPicPr>
                   </pic:nvPicPr>
                   <pic:blipFill>
-                    <a:blip r:embed="rId85"/>
+                    <a:blip r:embed="rId84"/>
                     <a:stretch>
                       <a:fillRect/>
                     </a:stretch>
@@ -21987,7 +21916,7 @@
                     </pic:cNvPicPr>
                   </pic:nvPicPr>
                   <pic:blipFill>
-                    <a:blip r:embed="rId86"/>
+                    <a:blip r:embed="rId85"/>
                     <a:stretch>
                       <a:fillRect/>
                     </a:stretch>
@@ -22258,7 +22187,7 @@
                     </pic:cNvPicPr>
                   </pic:nvPicPr>
                   <pic:blipFill>
-                    <a:blip r:embed="rId87"/>
+                    <a:blip r:embed="rId86"/>
                     <a:stretch>
                       <a:fillRect/>
                     </a:stretch>
@@ -22310,7 +22239,7 @@
                     </pic:cNvPicPr>
                   </pic:nvPicPr>
                   <pic:blipFill>
-                    <a:blip r:embed="rId88"/>
+                    <a:blip r:embed="rId87"/>
                     <a:stretch>
                       <a:fillRect/>
                     </a:stretch>
@@ -22426,7 +22355,7 @@
                     </pic:cNvPicPr>
                   </pic:nvPicPr>
                   <pic:blipFill>
-                    <a:blip r:embed="rId89"/>
+                    <a:blip r:embed="rId88"/>
                     <a:stretch>
                       <a:fillRect/>
                     </a:stretch>
@@ -22479,7 +22408,7 @@
                     </pic:cNvPicPr>
                   </pic:nvPicPr>
                   <pic:blipFill>
-                    <a:blip r:embed="rId90"/>
+                    <a:blip r:embed="rId89"/>
                     <a:stretch>
                       <a:fillRect/>
                     </a:stretch>
@@ -22623,7 +22552,7 @@
                     </pic:cNvPicPr>
                   </pic:nvPicPr>
                   <pic:blipFill>
-                    <a:blip r:embed="rId91"/>
+                    <a:blip r:embed="rId90"/>
                     <a:stretch>
                       <a:fillRect/>
                     </a:stretch>
@@ -22689,7 +22618,7 @@
                     </pic:cNvPicPr>
                   </pic:nvPicPr>
                   <pic:blipFill>
-                    <a:blip r:embed="rId92"/>
+                    <a:blip r:embed="rId91"/>
                     <a:stretch>
                       <a:fillRect/>
                     </a:stretch>
@@ -22866,7 +22795,7 @@
                     </pic:cNvPicPr>
                   </pic:nvPicPr>
                   <pic:blipFill>
-                    <a:blip r:embed="rId93"/>
+                    <a:blip r:embed="rId92"/>
                     <a:srcRect l="904" t="1286" r="868" b="6815"/>
                     <a:stretch>
                       <a:fillRect/>
@@ -23080,7 +23009,7 @@
           <w:szCs w:val="22"/>
           <w:lang w:val="en-IN"/>
         </w:rPr>
-        <w:t xml:space="preserve">Node’s ips are: </w:t>
+        <w:t xml:space="preserve">Node’s IPs are: </w:t>
       </w:r>
       <w:r>
         <w:rPr>
@@ -23195,7 +23124,7 @@
           <w:szCs w:val="22"/>
           <w:lang w:val="en-IN"/>
         </w:rPr>
-        <w:t>So, we have now 8 combinations. Each node’s ips with 2 ports.</w:t>
+        <w:t>So, we have now 8 combinations. Each node’s IPs with 2 ports.</w:t>
       </w:r>
     </w:p>
     <w:p>
@@ -23557,7 +23486,7 @@
                     </pic:cNvPicPr>
                   </pic:nvPicPr>
                   <pic:blipFill>
-                    <a:blip r:embed="rId94"/>
+                    <a:blip r:embed="rId93"/>
                     <a:stretch>
                       <a:fillRect/>
                     </a:stretch>
@@ -23762,7 +23691,7 @@
                     </pic:cNvPicPr>
                   </pic:nvPicPr>
                   <pic:blipFill>
-                    <a:blip r:embed="rId95"/>
+                    <a:blip r:embed="rId94"/>
                     <a:srcRect r="18531"/>
                     <a:stretch>
                       <a:fillRect/>
@@ -23878,7 +23807,7 @@
           <w:iCs w:val="0"/>
           <w:lang w:val="en-IN"/>
         </w:rPr>
-        <w:t xml:space="preserve"> it upates the </w:t>
+        <w:t xml:space="preserve"> it updates the </w:t>
       </w:r>
       <w:r>
         <w:rPr>
@@ -23896,7 +23825,7 @@
           <w:iCs w:val="0"/>
           <w:lang w:val="en-IN"/>
         </w:rPr>
-        <w:t xml:space="preserve"> cacha.</w:t>
+        <w:t xml:space="preserve"> cache.</w:t>
       </w:r>
     </w:p>
     <w:p>
@@ -23941,7 +23870,7 @@
           <w:iCs w:val="0"/>
           <w:lang w:val="en-IN"/>
         </w:rPr>
-        <w:t xml:space="preserve"> and store in the persistenct data storage which is </w:t>
+        <w:t xml:space="preserve"> and store in the persistent data storage which is </w:t>
       </w:r>
       <w:r>
         <w:rPr>
@@ -24822,7 +24751,7 @@
                     </pic:cNvPicPr>
                   </pic:nvPicPr>
                   <pic:blipFill>
-                    <a:blip r:embed="rId96"/>
+                    <a:blip r:embed="rId95"/>
                     <a:srcRect l="9513" t="15517" r="8994" b="25032"/>
                     <a:stretch>
                       <a:fillRect/>
@@ -25251,7 +25180,7 @@
                     </pic:cNvPicPr>
                   </pic:nvPicPr>
                   <pic:blipFill>
-                    <a:blip r:embed="rId97"/>
+                    <a:blip r:embed="rId96"/>
                     <a:stretch>
                       <a:fillRect/>
                     </a:stretch>
@@ -25891,7 +25820,7 @@
                     </pic:cNvPicPr>
                   </pic:nvPicPr>
                   <pic:blipFill>
-                    <a:blip r:embed="rId98"/>
+                    <a:blip r:embed="rId97"/>
                     <a:stretch>
                       <a:fillRect/>
                     </a:stretch>
@@ -26113,7 +26042,7 @@
                     </pic:cNvPicPr>
                   </pic:nvPicPr>
                   <pic:blipFill>
-                    <a:blip r:embed="rId99"/>
+                    <a:blip r:embed="rId98"/>
                     <a:stretch>
                       <a:fillRect/>
                     </a:stretch>
@@ -26224,7 +26153,7 @@
                     </pic:cNvPicPr>
                   </pic:nvPicPr>
                   <pic:blipFill>
-                    <a:blip r:embed="rId100"/>
+                    <a:blip r:embed="rId99"/>
                     <a:stretch>
                       <a:fillRect/>
                     </a:stretch>
@@ -26804,7 +26733,7 @@
                     </pic:cNvPicPr>
                   </pic:nvPicPr>
                   <pic:blipFill>
-                    <a:blip r:embed="rId101"/>
+                    <a:blip r:embed="rId100"/>
                     <a:stretch>
                       <a:fillRect/>
                     </a:stretch>
@@ -27095,7 +27024,7 @@
                     </pic:cNvPicPr>
                   </pic:nvPicPr>
                   <pic:blipFill>
-                    <a:blip r:embed="rId102"/>
+                    <a:blip r:embed="rId101"/>
                     <a:stretch>
                       <a:fillRect/>
                     </a:stretch>
@@ -27257,7 +27186,7 @@
                     </pic:cNvPicPr>
                   </pic:nvPicPr>
                   <pic:blipFill>
-                    <a:blip r:embed="rId103"/>
+                    <a:blip r:embed="rId102"/>
                     <a:stretch>
                       <a:fillRect/>
                     </a:stretch>
@@ -27606,7 +27535,7 @@
                     </pic:cNvPicPr>
                   </pic:nvPicPr>
                   <pic:blipFill>
-                    <a:blip r:embed="rId104"/>
+                    <a:blip r:embed="rId103"/>
                     <a:stretch>
                       <a:fillRect/>
                     </a:stretch>
@@ -28697,7 +28626,7 @@
                     </pic:cNvPicPr>
                   </pic:nvPicPr>
                   <pic:blipFill>
-                    <a:blip r:embed="rId105"/>
+                    <a:blip r:embed="rId104"/>
                     <a:stretch>
                       <a:fillRect/>
                     </a:stretch>
@@ -28757,7 +28686,7 @@
                     </pic:cNvPicPr>
                   </pic:nvPicPr>
                   <pic:blipFill>
-                    <a:blip r:embed="rId106"/>
+                    <a:blip r:embed="rId105"/>
                     <a:stretch>
                       <a:fillRect/>
                     </a:stretch>
@@ -29249,7 +29178,7 @@
                     </pic:cNvPicPr>
                   </pic:nvPicPr>
                   <pic:blipFill>
-                    <a:blip r:embed="rId107"/>
+                    <a:blip r:embed="rId106"/>
                     <a:stretch>
                       <a:fillRect/>
                     </a:stretch>
@@ -29327,7 +29256,7 @@
                     </pic:cNvPicPr>
                   </pic:nvPicPr>
                   <pic:blipFill>
-                    <a:blip r:embed="rId108"/>
+                    <a:blip r:embed="rId107"/>
                     <a:stretch>
                       <a:fillRect/>
                     </a:stretch>
@@ -29613,8 +29542,6 @@
         </w:rPr>
         <w:t>.</w:t>
       </w:r>
-      <w:bookmarkStart w:id="0" w:name="_GoBack"/>
-      <w:bookmarkEnd w:id="0"/>
       <w:r>
         <w:rPr>
           <w:rFonts w:hint="default" w:ascii="Bodoni MT" w:hAnsi="Bodoni MT" w:eastAsia="Microsoft YaHei" w:cs="Bodoni MT"/>
@@ -29783,7 +29710,7 @@
           <w:rFonts w:hint="default" w:ascii="Bodoni MT" w:hAnsi="Bodoni MT" w:eastAsia="Microsoft YaHei" w:cs="Bodoni MT"/>
           <w:lang w:val="en-IN"/>
         </w:rPr>
-        <w:t xml:space="preserve">If there are multiple containers running inside same Pod, then all the containrs will be having </w:t>
+        <w:t xml:space="preserve">If there are multiple containers running inside same Pod, then all the containers will be having </w:t>
       </w:r>
       <w:r>
         <w:rPr>
@@ -30002,7 +29929,7 @@
                     </pic:cNvPicPr>
                   </pic:nvPicPr>
                   <pic:blipFill>
-                    <a:blip r:embed="rId109"/>
+                    <a:blip r:embed="rId108"/>
                     <a:stretch>
                       <a:fillRect/>
                     </a:stretch>
@@ -31265,7 +31192,7 @@
                     </pic:cNvPicPr>
                   </pic:nvPicPr>
                   <pic:blipFill>
-                    <a:blip r:embed="rId110"/>
+                    <a:blip r:embed="rId109"/>
                     <a:stretch>
                       <a:fillRect/>
                     </a:stretch>
@@ -31388,7 +31315,7 @@
                     </pic:cNvPicPr>
                   </pic:nvPicPr>
                   <pic:blipFill>
-                    <a:blip r:embed="rId111"/>
+                    <a:blip r:embed="rId110"/>
                     <a:stretch>
                       <a:fillRect/>
                     </a:stretch>
@@ -31468,13 +31395,6 @@
         <w:jc w:val="left"/>
         <w:rPr>
           <w:rFonts w:hint="default" w:ascii="Bodoni MT" w:hAnsi="Bodoni MT" w:eastAsia="Microsoft YaHei" w:cs="Bodoni MT"/>
-          <w:color w:val="E7E6E6" w:themeColor="background2"/>
-          <w:highlight w:val="darkRed"/>
-          <w14:textFill>
-            <w14:solidFill>
-              <w14:schemeClr w14:val="bg2"/>
-            </w14:solidFill>
-          </w14:textFill>
         </w:rPr>
       </w:pPr>
       <w:r>
@@ -31584,24 +31504,8 @@
         </w:rPr>
         <w:t>because both are in different namespace. Have to see why and how</w:t>
       </w:r>
-    </w:p>
-    <w:p>
-      <w:pPr>
-        <w:keepNext w:val="0"/>
-        <w:keepLines w:val="0"/>
-        <w:widowControl/>
-        <w:numPr>
-          <w:ilvl w:val="1"/>
-          <w:numId w:val="11"/>
-        </w:numPr>
-        <w:suppressLineNumbers w:val="0"/>
-        <w:spacing w:before="0" w:beforeAutospacing="0" w:after="0" w:afterAutospacing="0" w:line="360" w:lineRule="auto"/>
-        <w:ind w:left="840" w:leftChars="0" w:right="0" w:hanging="420" w:firstLineChars="0"/>
-        <w:jc w:val="left"/>
-        <w:rPr>
-          <w:rFonts w:hint="default" w:ascii="Bodoni MT" w:hAnsi="Bodoni MT" w:eastAsia="Microsoft YaHei" w:cs="Bodoni MT"/>
-        </w:rPr>
-      </w:pPr>
+      <w:bookmarkStart w:id="0" w:name="_GoBack"/>
+      <w:bookmarkEnd w:id="0"/>
     </w:p>
     <w:p>
       <w:pPr>
@@ -31753,7 +31657,7 @@
                     </pic:cNvPicPr>
                   </pic:nvPicPr>
                   <pic:blipFill>
-                    <a:blip r:embed="rId112"/>
+                    <a:blip r:embed="rId111"/>
                     <a:stretch>
                       <a:fillRect/>
                     </a:stretch>
@@ -31874,7 +31778,7 @@
                     </pic:cNvPicPr>
                   </pic:nvPicPr>
                   <pic:blipFill>
-                    <a:blip r:embed="rId113"/>
+                    <a:blip r:embed="rId112"/>
                     <a:stretch>
                       <a:fillRect/>
                     </a:stretch>
@@ -31945,7 +31849,7 @@
                     </pic:cNvPicPr>
                   </pic:nvPicPr>
                   <pic:blipFill>
-                    <a:blip r:embed="rId114"/>
+                    <a:blip r:embed="rId113"/>
                     <a:stretch>
                       <a:fillRect/>
                     </a:stretch>
@@ -32016,7 +31920,7 @@
                     </pic:cNvPicPr>
                   </pic:nvPicPr>
                   <pic:blipFill>
-                    <a:blip r:embed="rId115"/>
+                    <a:blip r:embed="rId114"/>
                     <a:stretch>
                       <a:fillRect/>
                     </a:stretch>
@@ -32225,7 +32129,7 @@
                     </pic:cNvPicPr>
                   </pic:nvPicPr>
                   <pic:blipFill>
-                    <a:blip r:embed="rId116"/>
+                    <a:blip r:embed="rId115"/>
                     <a:stretch>
                       <a:fillRect/>
                     </a:stretch>
@@ -32346,7 +32250,7 @@
                     </pic:cNvPicPr>
                   </pic:nvPicPr>
                   <pic:blipFill>
-                    <a:blip r:embed="rId117"/>
+                    <a:blip r:embed="rId116"/>
                     <a:stretch>
                       <a:fillRect/>
                     </a:stretch>
@@ -32569,7 +32473,7 @@
                     </pic:cNvPicPr>
                   </pic:nvPicPr>
                   <pic:blipFill>
-                    <a:blip r:embed="rId118"/>
+                    <a:blip r:embed="rId117"/>
                     <a:stretch>
                       <a:fillRect/>
                     </a:stretch>
@@ -32672,7 +32576,7 @@
                     </pic:cNvPicPr>
                   </pic:nvPicPr>
                   <pic:blipFill>
-                    <a:blip r:embed="rId119"/>
+                    <a:blip r:embed="rId118"/>
                     <a:stretch>
                       <a:fillRect/>
                     </a:stretch>
@@ -32975,7 +32879,7 @@
                     </pic:cNvPicPr>
                   </pic:nvPicPr>
                   <pic:blipFill>
-                    <a:blip r:embed="rId120"/>
+                    <a:blip r:embed="rId119"/>
                     <a:stretch>
                       <a:fillRect/>
                     </a:stretch>
@@ -33252,7 +33156,7 @@
                     </pic:cNvPicPr>
                   </pic:nvPicPr>
                   <pic:blipFill>
-                    <a:blip r:embed="rId121"/>
+                    <a:blip r:embed="rId120"/>
                     <a:stretch>
                       <a:fillRect/>
                     </a:stretch>
@@ -33432,7 +33336,7 @@
                     </pic:cNvPicPr>
                   </pic:nvPicPr>
                   <pic:blipFill>
-                    <a:blip r:embed="rId122"/>
+                    <a:blip r:embed="rId121"/>
                     <a:stretch>
                       <a:fillRect/>
                     </a:stretch>
@@ -33756,7 +33660,7 @@
                     </pic:cNvPicPr>
                   </pic:nvPicPr>
                   <pic:blipFill>
-                    <a:blip r:embed="rId123"/>
+                    <a:blip r:embed="rId122"/>
                     <a:stretch>
                       <a:fillRect/>
                     </a:stretch>
@@ -34059,7 +33963,7 @@
                     </pic:cNvPicPr>
                   </pic:nvPicPr>
                   <pic:blipFill>
-                    <a:blip r:embed="rId124"/>
+                    <a:blip r:embed="rId123"/>
                     <a:stretch>
                       <a:fillRect/>
                     </a:stretch>
@@ -34298,7 +34202,7 @@
                     </pic:cNvPicPr>
                   </pic:nvPicPr>
                   <pic:blipFill>
-                    <a:blip r:embed="rId124"/>
+                    <a:blip r:embed="rId123"/>
                     <a:stretch>
                       <a:fillRect/>
                     </a:stretch>
@@ -34758,7 +34662,7 @@
                     </pic:cNvPicPr>
                   </pic:nvPicPr>
                   <pic:blipFill>
-                    <a:blip r:embed="rId125"/>
+                    <a:blip r:embed="rId124"/>
                     <a:stretch>
                       <a:fillRect/>
                     </a:stretch>
@@ -35621,9 +35525,9 @@
     <w:lsdException w:qFormat="1" w:unhideWhenUsed="0" w:uiPriority="64" w:semiHidden="0" w:name="Medium Shading 2"/>
     <w:lsdException w:qFormat="1" w:unhideWhenUsed="0" w:uiPriority="65" w:semiHidden="0" w:name="Medium List 1"/>
     <w:lsdException w:unhideWhenUsed="0" w:uiPriority="66" w:semiHidden="0" w:name="Medium List 2"/>
-    <w:lsdException w:unhideWhenUsed="0" w:uiPriority="67" w:semiHidden="0" w:name="Medium Grid 1"/>
+    <w:lsdException w:qFormat="1" w:unhideWhenUsed="0" w:uiPriority="67" w:semiHidden="0" w:name="Medium Grid 1"/>
     <w:lsdException w:qFormat="1" w:unhideWhenUsed="0" w:uiPriority="68" w:semiHidden="0" w:name="Medium Grid 2"/>
-    <w:lsdException w:unhideWhenUsed="0" w:uiPriority="69" w:semiHidden="0" w:name="Medium Grid 3"/>
+    <w:lsdException w:qFormat="1" w:unhideWhenUsed="0" w:uiPriority="69" w:semiHidden="0" w:name="Medium Grid 3"/>
     <w:lsdException w:qFormat="1" w:unhideWhenUsed="0" w:uiPriority="70" w:semiHidden="0" w:name="Dark List"/>
     <w:lsdException w:qFormat="1" w:unhideWhenUsed="0" w:uiPriority="71" w:semiHidden="0" w:name="Colorful Shading"/>
     <w:lsdException w:qFormat="1" w:unhideWhenUsed="0" w:uiPriority="72" w:semiHidden="0" w:name="Colorful List"/>
@@ -35634,10 +35538,10 @@
     <w:lsdException w:qFormat="1" w:unhideWhenUsed="0" w:uiPriority="63" w:semiHidden="0" w:name="Medium Shading 1 Accent 1"/>
     <w:lsdException w:qFormat="1" w:unhideWhenUsed="0" w:uiPriority="64" w:semiHidden="0" w:name="Medium Shading 2 Accent 1"/>
     <w:lsdException w:qFormat="1" w:unhideWhenUsed="0" w:uiPriority="65" w:semiHidden="0" w:name="Medium List 1 Accent 1"/>
-    <w:lsdException w:unhideWhenUsed="0" w:uiPriority="66" w:semiHidden="0" w:name="Medium List 2 Accent 1"/>
+    <w:lsdException w:qFormat="1" w:unhideWhenUsed="0" w:uiPriority="66" w:semiHidden="0" w:name="Medium List 2 Accent 1"/>
     <w:lsdException w:unhideWhenUsed="0" w:uiPriority="67" w:semiHidden="0" w:name="Medium Grid 1 Accent 1"/>
-    <w:lsdException w:unhideWhenUsed="0" w:uiPriority="68" w:semiHidden="0" w:name="Medium Grid 2 Accent 1"/>
-    <w:lsdException w:unhideWhenUsed="0" w:uiPriority="69" w:semiHidden="0" w:name="Medium Grid 3 Accent 1"/>
+    <w:lsdException w:qFormat="1" w:unhideWhenUsed="0" w:uiPriority="68" w:semiHidden="0" w:name="Medium Grid 2 Accent 1"/>
+    <w:lsdException w:qFormat="1" w:unhideWhenUsed="0" w:uiPriority="69" w:semiHidden="0" w:name="Medium Grid 3 Accent 1"/>
     <w:lsdException w:qFormat="1" w:unhideWhenUsed="0" w:uiPriority="70" w:semiHidden="0" w:name="Dark List Accent 1"/>
     <w:lsdException w:qFormat="1" w:unhideWhenUsed="0" w:uiPriority="71" w:semiHidden="0" w:name="Colorful Shading Accent 1"/>
     <w:lsdException w:qFormat="1" w:unhideWhenUsed="0" w:uiPriority="72" w:semiHidden="0" w:name="Colorful List Accent 1"/>
@@ -35648,11 +35552,11 @@
     <w:lsdException w:qFormat="1" w:unhideWhenUsed="0" w:uiPriority="63" w:semiHidden="0" w:name="Medium Shading 1 Accent 2"/>
     <w:lsdException w:qFormat="1" w:unhideWhenUsed="0" w:uiPriority="64" w:semiHidden="0" w:name="Medium Shading 2 Accent 2"/>
     <w:lsdException w:qFormat="1" w:unhideWhenUsed="0" w:uiPriority="65" w:semiHidden="0" w:name="Medium List 1 Accent 2"/>
-    <w:lsdException w:unhideWhenUsed="0" w:uiPriority="66" w:semiHidden="0" w:name="Medium List 2 Accent 2"/>
-    <w:lsdException w:unhideWhenUsed="0" w:uiPriority="67" w:semiHidden="0" w:name="Medium Grid 1 Accent 2"/>
+    <w:lsdException w:qFormat="1" w:unhideWhenUsed="0" w:uiPriority="66" w:semiHidden="0" w:name="Medium List 2 Accent 2"/>
+    <w:lsdException w:qFormat="1" w:unhideWhenUsed="0" w:uiPriority="67" w:semiHidden="0" w:name="Medium Grid 1 Accent 2"/>
     <w:lsdException w:qFormat="1" w:unhideWhenUsed="0" w:uiPriority="68" w:semiHidden="0" w:name="Medium Grid 2 Accent 2"/>
     <w:lsdException w:qFormat="1" w:unhideWhenUsed="0" w:uiPriority="69" w:semiHidden="0" w:name="Medium Grid 3 Accent 2"/>
-    <w:lsdException w:unhideWhenUsed="0" w:uiPriority="70" w:semiHidden="0" w:name="Dark List Accent 2"/>
+    <w:lsdException w:qFormat="1" w:unhideWhenUsed="0" w:uiPriority="70" w:semiHidden="0" w:name="Dark List Accent 2"/>
     <w:lsdException w:qFormat="1" w:unhideWhenUsed="0" w:uiPriority="71" w:semiHidden="0" w:name="Colorful Shading Accent 2"/>
     <w:lsdException w:qFormat="1" w:unhideWhenUsed="0" w:uiPriority="72" w:semiHidden="0" w:name="Colorful List Accent 2"/>
     <w:lsdException w:qFormat="1" w:unhideWhenUsed="0" w:uiPriority="73" w:semiHidden="0" w:name="Colorful Grid Accent 2"/>
@@ -35677,10 +35581,10 @@
     <w:lsdException w:qFormat="1" w:unhideWhenUsed="0" w:uiPriority="64" w:semiHidden="0" w:name="Medium Shading 2 Accent 4"/>
     <w:lsdException w:qFormat="1" w:unhideWhenUsed="0" w:uiPriority="65" w:semiHidden="0" w:name="Medium List 1 Accent 4"/>
     <w:lsdException w:qFormat="1" w:unhideWhenUsed="0" w:uiPriority="66" w:semiHidden="0" w:name="Medium List 2 Accent 4"/>
-    <w:lsdException w:unhideWhenUsed="0" w:uiPriority="67" w:semiHidden="0" w:name="Medium Grid 1 Accent 4"/>
-    <w:lsdException w:unhideWhenUsed="0" w:uiPriority="68" w:semiHidden="0" w:name="Medium Grid 2 Accent 4"/>
+    <w:lsdException w:qFormat="1" w:unhideWhenUsed="0" w:uiPriority="67" w:semiHidden="0" w:name="Medium Grid 1 Accent 4"/>
+    <w:lsdException w:qFormat="1" w:unhideWhenUsed="0" w:uiPriority="68" w:semiHidden="0" w:name="Medium Grid 2 Accent 4"/>
     <w:lsdException w:qFormat="1" w:unhideWhenUsed="0" w:uiPriority="69" w:semiHidden="0" w:name="Medium Grid 3 Accent 4"/>
-    <w:lsdException w:unhideWhenUsed="0" w:uiPriority="70" w:semiHidden="0" w:name="Dark List Accent 4"/>
+    <w:lsdException w:qFormat="1" w:unhideWhenUsed="0" w:uiPriority="70" w:semiHidden="0" w:name="Dark List Accent 4"/>
     <w:lsdException w:qFormat="1" w:unhideWhenUsed="0" w:uiPriority="71" w:semiHidden="0" w:name="Colorful Shading Accent 4"/>
     <w:lsdException w:qFormat="1" w:unhideWhenUsed="0" w:uiPriority="72" w:semiHidden="0" w:name="Colorful List Accent 4"/>
     <w:lsdException w:qFormat="1" w:unhideWhenUsed="0" w:uiPriority="73" w:semiHidden="0" w:name="Colorful Grid Accent 4"/>
@@ -35690,8 +35594,8 @@
     <w:lsdException w:qFormat="1" w:unhideWhenUsed="0" w:uiPriority="63" w:semiHidden="0" w:name="Medium Shading 1 Accent 5"/>
     <w:lsdException w:qFormat="1" w:unhideWhenUsed="0" w:uiPriority="64" w:semiHidden="0" w:name="Medium Shading 2 Accent 5"/>
     <w:lsdException w:unhideWhenUsed="0" w:uiPriority="65" w:semiHidden="0" w:name="Medium List 1 Accent 5"/>
-    <w:lsdException w:unhideWhenUsed="0" w:uiPriority="66" w:semiHidden="0" w:name="Medium List 2 Accent 5"/>
-    <w:lsdException w:unhideWhenUsed="0" w:uiPriority="67" w:semiHidden="0" w:name="Medium Grid 1 Accent 5"/>
+    <w:lsdException w:qFormat="1" w:unhideWhenUsed="0" w:uiPriority="66" w:semiHidden="0" w:name="Medium List 2 Accent 5"/>
+    <w:lsdException w:qFormat="1" w:unhideWhenUsed="0" w:uiPriority="67" w:semiHidden="0" w:name="Medium Grid 1 Accent 5"/>
     <w:lsdException w:unhideWhenUsed="0" w:uiPriority="68" w:semiHidden="0" w:name="Medium Grid 2 Accent 5"/>
     <w:lsdException w:unhideWhenUsed="0" w:uiPriority="69" w:semiHidden="0" w:name="Medium Grid 3 Accent 5"/>
     <w:lsdException w:qFormat="1" w:unhideWhenUsed="0" w:uiPriority="70" w:semiHidden="0" w:name="Dark List Accent 5"/>
@@ -35704,10 +35608,10 @@
     <w:lsdException w:qFormat="1" w:unhideWhenUsed="0" w:uiPriority="63" w:semiHidden="0" w:name="Medium Shading 1 Accent 6"/>
     <w:lsdException w:qFormat="1" w:unhideWhenUsed="0" w:uiPriority="64" w:semiHidden="0" w:name="Medium Shading 2 Accent 6"/>
     <w:lsdException w:unhideWhenUsed="0" w:uiPriority="65" w:semiHidden="0" w:name="Medium List 1 Accent 6"/>
-    <w:lsdException w:unhideWhenUsed="0" w:uiPriority="66" w:semiHidden="0" w:name="Medium List 2 Accent 6"/>
+    <w:lsdException w:qFormat="1" w:unhideWhenUsed="0" w:uiPriority="66" w:semiHidden="0" w:name="Medium List 2 Accent 6"/>
     <w:lsdException w:qFormat="1" w:unhideWhenUsed="0" w:uiPriority="67" w:semiHidden="0" w:name="Medium Grid 1 Accent 6"/>
-    <w:lsdException w:unhideWhenUsed="0" w:uiPriority="68" w:semiHidden="0" w:name="Medium Grid 2 Accent 6"/>
-    <w:lsdException w:unhideWhenUsed="0" w:uiPriority="69" w:semiHidden="0" w:name="Medium Grid 3 Accent 6"/>
+    <w:lsdException w:qFormat="1" w:unhideWhenUsed="0" w:uiPriority="68" w:semiHidden="0" w:name="Medium Grid 2 Accent 6"/>
+    <w:lsdException w:qFormat="1" w:unhideWhenUsed="0" w:uiPriority="69" w:semiHidden="0" w:name="Medium Grid 3 Accent 6"/>
     <w:lsdException w:qFormat="1" w:unhideWhenUsed="0" w:uiPriority="70" w:semiHidden="0" w:name="Dark List Accent 6"/>
     <w:lsdException w:qFormat="1" w:unhideWhenUsed="0" w:uiPriority="71" w:semiHidden="0" w:name="Colorful Shading Accent 6"/>
     <w:lsdException w:qFormat="1" w:unhideWhenUsed="0" w:uiPriority="72" w:semiHidden="0" w:name="Colorful List Accent 6"/>
@@ -44308,6 +44212,7 @@
   <w:style w:type="table" w:styleId="194">
     <w:name w:val="Medium List 2 Accent 1"/>
     <w:basedOn w:val="12"/>
+    <w:qFormat/>
     <w:uiPriority w:val="66"/>
     <w:rPr>
       <w:rFonts w:ascii="SimSun" w:hAnsi="SimSun" w:eastAsia="Courier New" w:cs="Times New Roman"/>
@@ -44423,6 +44328,7 @@
   <w:style w:type="table" w:styleId="195">
     <w:name w:val="Medium List 2 Accent 2"/>
     <w:basedOn w:val="12"/>
+    <w:qFormat/>
     <w:uiPriority w:val="66"/>
     <w:rPr>
       <w:rFonts w:ascii="SimSun" w:hAnsi="SimSun" w:eastAsia="Courier New" w:cs="Times New Roman"/>
@@ -44769,6 +44675,7 @@
   <w:style w:type="table" w:styleId="198">
     <w:name w:val="Medium List 2 Accent 5"/>
     <w:basedOn w:val="12"/>
+    <w:qFormat/>
     <w:uiPriority w:val="66"/>
     <w:rPr>
       <w:rFonts w:ascii="SimSun" w:hAnsi="SimSun" w:eastAsia="Courier New" w:cs="Times New Roman"/>
@@ -44884,6 +44791,7 @@
   <w:style w:type="table" w:styleId="199">
     <w:name w:val="Medium List 2 Accent 6"/>
     <w:basedOn w:val="12"/>
+    <w:qFormat/>
     <w:uiPriority w:val="66"/>
     <w:rPr>
       <w:rFonts w:ascii="SimSun" w:hAnsi="SimSun" w:eastAsia="Courier New" w:cs="Times New Roman"/>
@@ -44999,6 +44907,7 @@
   <w:style w:type="table" w:styleId="200">
     <w:name w:val="Medium Grid 1"/>
     <w:basedOn w:val="12"/>
+    <w:qFormat/>
     <w:uiPriority w:val="67"/>
     <w:tblPr>
       <w:tblBorders>
@@ -45119,6 +45028,7 @@
   <w:style w:type="table" w:styleId="202">
     <w:name w:val="Medium Grid 1 Accent 2"/>
     <w:basedOn w:val="12"/>
+    <w:qFormat/>
     <w:uiPriority w:val="67"/>
     <w:tblPr>
       <w:tblBorders>
@@ -45240,6 +45150,7 @@
   <w:style w:type="table" w:styleId="204">
     <w:name w:val="Medium Grid 1 Accent 4"/>
     <w:basedOn w:val="12"/>
+    <w:qFormat/>
     <w:uiPriority w:val="67"/>
     <w:tblPr>
       <w:tblBorders>
@@ -45300,6 +45211,7 @@
   <w:style w:type="table" w:styleId="205">
     <w:name w:val="Medium Grid 1 Accent 5"/>
     <w:basedOn w:val="12"/>
+    <w:qFormat/>
     <w:uiPriority w:val="67"/>
     <w:tblPr>
       <w:tblBorders>
@@ -45534,6 +45446,7 @@
   <w:style w:type="table" w:styleId="208">
     <w:name w:val="Medium Grid 2 Accent 1"/>
     <w:basedOn w:val="12"/>
+    <w:qFormat/>
     <w:uiPriority w:val="68"/>
     <w:rPr>
       <w:rFonts w:ascii="SimSun" w:hAnsi="SimSun" w:eastAsia="Courier New" w:cs="Times New Roman"/>
@@ -45872,6 +45785,7 @@
   <w:style w:type="table" w:styleId="211">
     <w:name w:val="Medium Grid 2 Accent 4"/>
     <w:basedOn w:val="12"/>
+    <w:qFormat/>
     <w:uiPriority w:val="68"/>
     <w:rPr>
       <w:rFonts w:ascii="SimSun" w:hAnsi="SimSun" w:eastAsia="Courier New" w:cs="Times New Roman"/>
@@ -46096,6 +46010,7 @@
   <w:style w:type="table" w:styleId="213">
     <w:name w:val="Medium Grid 2 Accent 6"/>
     <w:basedOn w:val="12"/>
+    <w:qFormat/>
     <w:uiPriority w:val="68"/>
     <w:rPr>
       <w:rFonts w:ascii="SimSun" w:hAnsi="SimSun" w:eastAsia="Courier New" w:cs="Times New Roman"/>
@@ -46208,6 +46123,7 @@
   <w:style w:type="table" w:styleId="214">
     <w:name w:val="Medium Grid 3"/>
     <w:basedOn w:val="12"/>
+    <w:qFormat/>
     <w:uiPriority w:val="69"/>
     <w:tblPr>
       <w:tblBorders>
@@ -46336,6 +46252,7 @@
   <w:style w:type="table" w:styleId="215">
     <w:name w:val="Medium Grid 3 Accent 1"/>
     <w:basedOn w:val="12"/>
+    <w:qFormat/>
     <w:uiPriority w:val="69"/>
     <w:tblPr>
       <w:tblBorders>
@@ -46979,6 +46896,7 @@
   <w:style w:type="table" w:styleId="220">
     <w:name w:val="Medium Grid 3 Accent 6"/>
     <w:basedOn w:val="12"/>
+    <w:qFormat/>
     <w:uiPriority w:val="69"/>
     <w:tblPr>
       <w:tblBorders>
@@ -47315,6 +47233,7 @@
   <w:style w:type="table" w:styleId="223">
     <w:name w:val="Dark List Accent 2"/>
     <w:basedOn w:val="12"/>
+    <w:qFormat/>
     <w:uiPriority w:val="70"/>
     <w:rPr>
       <w:color w:val="FFFFFF"/>
@@ -47522,6 +47441,7 @@
   <w:style w:type="table" w:styleId="225">
     <w:name w:val="Dark List Accent 4"/>
     <w:basedOn w:val="12"/>
+    <w:qFormat/>
     <w:uiPriority w:val="70"/>
     <w:rPr>
       <w:color w:val="FFFFFF"/>

</xml_diff>